<commit_message>
docs: align guides with generic dataset v2
</commit_message>
<xml_diff>
--- a/docs/LIDAR_LABEL_TOOL_BEGINNER_SETUP_GUIDE_KO.docx
+++ b/docs/LIDAR_LABEL_TOOL_BEGINNER_SETUP_GUIDE_KO.docx
@@ -58,7 +58,7 @@
           <w:color w:val="667788"/>
           <w:sz w:val="24"/>
         </w:rPr>
-        <w:t>Windows 10/11 · Ubuntu 22.04+ · Python 3.10+</w:t>
+        <w:t>Windows 10/11 · Ubuntu 22.04+ · 공식 Python 3.12 권장</w:t>
       </w:r>
     </w:p>
     <w:p>
@@ -73,7 +73,7 @@
           <w:color w:val="667788"/>
           <w:sz w:val="19"/>
         </w:rPr>
-        <w:t>내부 운영본 v0.3.0  |  2026-07-31</w:t>
+        <w:t>내부 운영본 v0.3.0  |  2026-08-09</w:t>
       </w:r>
     </w:p>
     <w:p>
@@ -153,10 +153,11 @@
       <w:r>
         <w:rPr>
           <w:rFonts w:ascii="Malgun Gothic" w:hAnsi="Malgun Gothic" w:eastAsia="Malgun Gothic"/>
+          <w:b w:val="0"/>
           <w:color w:val="243447"/>
           <w:sz w:val="21"/>
         </w:rPr>
-        <w:t>최초 1회만 Git·Python과 가상환경을 준비합니다. 이후에는 run_windows.bat 또는 ./run_linux.sh만 실행하면 됩니다.</w:t>
+        <w:t>새 Windows PC에는 공식 Python 3.12 64-bit가 필요합니다. 최초 1회 setup 후에는 OS별 run launcher만 실행합니다.</w:t>
       </w:r>
     </w:p>
     <w:p>
@@ -189,7 +190,7 @@
         <w:rPr>
           <w:rFonts w:ascii="Malgun Gothic" w:hAnsi="Malgun Gothic" w:eastAsia="Malgun Gothic"/>
         </w:rPr>
-        <w:t>이 문서는 프로젝트를 처음 보는 연구원이 GitHub에서 소스를 내려받고, 독립 가상환경을 구성한 뒤, 변환된 LiDAR·카메라 데이터셋을 열기까지의 절차를 순서대로 설명합니다.</w:t>
+        <w:t>이 문서는 프로젝트를 처음 보는 연구원이 현재 codex/v2 source를 내려받고, 공식 Python 기반 가상환경을 구성한 뒤, 일반 LiDAR 폴더를 범용 v2 데이터셋으로 만들어 라벨링하기까지의 절차를 설명합니다.</w:t>
       </w:r>
     </w:p>
     <w:p>
@@ -213,10 +214,11 @@
       <w:r>
         <w:rPr>
           <w:rFonts w:ascii="Malgun Gothic" w:hAnsi="Malgun Gothic" w:eastAsia="Malgun Gothic"/>
+          <w:b w:val="0"/>
           <w:color w:val="243447"/>
           <w:sz w:val="21"/>
         </w:rPr>
-        <w:t>프로그램 저장소, 원본 one_chip 데이터, 변환 데이터셋은 서로 다른 폴더입니다. 대용량 MCAP·BIN·JPG와 작업 라벨은 Git 저장소에 넣지 않습니다.</w:t>
+        <w:t>프로그램 저장소와 원본 LiDAR/image/timestamp, 구성 workspace 및 작업 라벨을 구분합니다. 대용량 데이터와 라벨은 Git 저장소에 넣지 않습니다.</w:t>
       </w:r>
     </w:p>
     <w:p>
@@ -376,18 +378,8 @@
             <w:vAlign w:val="center"/>
           </w:tcPr>
           <w:p>
-            <w:pPr>
-              <w:spacing w:before="0" w:after="0"/>
-              <w:jc w:val="center"/>
-            </w:pPr>
             <w:r>
-              <w:rPr>
-                <w:rFonts w:ascii="Malgun Gothic" w:hAnsi="Malgun Gothic" w:eastAsia="Malgun Gothic"/>
-                <w:b w:val="0"/>
-                <w:color w:val="243447"/>
-                <w:sz w:val="18"/>
-              </w:rPr>
-              <w:t>Git for Windows, Python 3.10+ 64-bit</w:t>
+              <w:t>Git for Windows, 공식 Python 3.12 x64</w:t>
             </w:r>
           </w:p>
         </w:tc>
@@ -403,18 +395,8 @@
             <w:vAlign w:val="center"/>
           </w:tcPr>
           <w:p>
-            <w:pPr>
-              <w:spacing w:before="0" w:after="0"/>
-              <w:jc w:val="center"/>
-            </w:pPr>
             <w:r>
-              <w:rPr>
-                <w:rFonts w:ascii="Malgun Gothic" w:hAnsi="Malgun Gothic" w:eastAsia="Malgun Gothic"/>
-                <w:b w:val="0"/>
-                <w:color w:val="243447"/>
-                <w:sz w:val="18"/>
-              </w:rPr>
-              <w:t>git, python3, python3-venv</w:t>
+              <w:t>git, Python 3.10+, python3-venv</w:t>
             </w:r>
           </w:p>
         </w:tc>
@@ -461,18 +443,8 @@
             <w:vAlign w:val="center"/>
           </w:tcPr>
           <w:p>
-            <w:pPr>
-              <w:spacing w:before="0" w:after="0"/>
-              <w:jc w:val="center"/>
-            </w:pPr>
             <w:r>
-              <w:rPr>
-                <w:rFonts w:ascii="Malgun Gothic" w:hAnsi="Malgun Gothic" w:eastAsia="Malgun Gothic"/>
-                <w:b w:val="0"/>
-                <w:color w:val="243447"/>
-                <w:sz w:val="18"/>
-              </w:rPr>
-              <w:t>setup_windows.bat</w:t>
+              <w:t>launchers/windows/setup_windows.bat</w:t>
             </w:r>
           </w:p>
         </w:tc>
@@ -489,18 +461,8 @@
             <w:vAlign w:val="center"/>
           </w:tcPr>
           <w:p>
-            <w:pPr>
-              <w:spacing w:before="0" w:after="0"/>
-              <w:jc w:val="center"/>
-            </w:pPr>
             <w:r>
-              <w:rPr>
-                <w:rFonts w:ascii="Malgun Gothic" w:hAnsi="Malgun Gothic" w:eastAsia="Malgun Gothic"/>
-                <w:b w:val="0"/>
-                <w:color w:val="243447"/>
-                <w:sz w:val="18"/>
-              </w:rPr>
-              <w:t>./setup_linux.sh</w:t>
+              <w:t>./launchers/linux/setup_linux.sh</w:t>
             </w:r>
           </w:p>
         </w:tc>
@@ -545,18 +507,8 @@
             <w:vAlign w:val="center"/>
           </w:tcPr>
           <w:p>
-            <w:pPr>
-              <w:spacing w:before="0" w:after="0"/>
-              <w:jc w:val="center"/>
-            </w:pPr>
             <w:r>
-              <w:rPr>
-                <w:rFonts w:ascii="Malgun Gothic" w:hAnsi="Malgun Gothic" w:eastAsia="Malgun Gothic"/>
-                <w:b w:val="0"/>
-                <w:color w:val="243447"/>
-                <w:sz w:val="18"/>
-              </w:rPr>
-              <w:t>run_windows.bat</w:t>
+              <w:t>launchers/windows/run_windows.bat</w:t>
             </w:r>
           </w:p>
         </w:tc>
@@ -572,18 +524,8 @@
             <w:vAlign w:val="center"/>
           </w:tcPr>
           <w:p>
-            <w:pPr>
-              <w:spacing w:before="0" w:after="0"/>
-              <w:jc w:val="center"/>
-            </w:pPr>
             <w:r>
-              <w:rPr>
-                <w:rFonts w:ascii="Malgun Gothic" w:hAnsi="Malgun Gothic" w:eastAsia="Malgun Gothic"/>
-                <w:b w:val="0"/>
-                <w:color w:val="243447"/>
-                <w:sz w:val="18"/>
-              </w:rPr>
-              <w:t>./run_linux.sh</w:t>
+              <w:t>./launchers/linux/run_linux.sh</w:t>
             </w:r>
           </w:p>
         </w:tc>
@@ -805,7 +747,7 @@
         <w:rPr>
           <w:rFonts w:ascii="Malgun Gothic" w:hAnsi="Malgun Gothic" w:eastAsia="Malgun Gothic"/>
         </w:rPr>
-        <w:t>Python 3.10 이상 64-bit</w:t>
+        <w:t>Windows: python.org 공식 Python 3.12 64-bit · Linux: Python 3.10 이상</w:t>
       </w:r>
     </w:p>
     <w:p>
@@ -1026,7 +968,7 @@
         <w:rPr>
           <w:rFonts w:ascii="Malgun Gothic" w:hAnsi="Malgun Gothic" w:eastAsia="Malgun Gothic"/>
         </w:rPr>
-        <w:t>Python 공식 Windows 다운로드 페이지에서 64-bit Python 3.10 이상을 받습니다.</w:t>
+        <w:t>Python 공식 Windows 다운로드 페이지에서 Python 3.12의 Windows installer (64-bit)를 받습니다.</w:t>
       </w:r>
     </w:p>
     <w:p>
@@ -1068,7 +1010,7 @@
         <w:rPr>
           <w:rFonts w:ascii="Malgun Gothic" w:hAnsi="Malgun Gothic" w:eastAsia="Malgun Gothic"/>
         </w:rPr>
-        <w:t>새 PowerShell에서 다음 중 하나로 확인합니다.</w:t>
+        <w:t>설치 후 열려 있던 PowerShell을 모두 닫고 새 PowerShell에서 확인합니다.</w:t>
       </w:r>
     </w:p>
     <w:p>
@@ -1087,8 +1029,7 @@
           <w:color w:val="EAF2F8"/>
           <w:sz w:val="17"/>
         </w:rPr>
-        <w:t>py -3 --version</w:t>
-        <w:br/>
+        <w:t>py -3.12 --version</w:t>
       </w:r>
       <w:r>
         <w:rPr>
@@ -1096,7 +1037,6 @@
           <w:color w:val="EAF2F8"/>
           <w:sz w:val="17"/>
         </w:rPr>
-        <w:t>python --version</w:t>
       </w:r>
     </w:p>
     <w:p>
@@ -1120,10 +1060,11 @@
       <w:r>
         <w:rPr>
           <w:rFonts w:ascii="Malgun Gothic" w:hAnsi="Malgun Gothic" w:eastAsia="Malgun Gothic"/>
+          <w:b w:val="0"/>
           <w:color w:val="243447"/>
           <w:sz w:val="21"/>
         </w:rPr>
-        <w:t>Python 3.10 이상이어야 합니다. 프로젝트 lock은 Python 3.10과 3.12에서 검증합니다.</w:t>
+        <w:t>Python 3.10 이상 64-bit를 지원하며 새 Windows PC의 검증 기준은 python.org 공식 Python 3.12입니다.</w:t>
       </w:r>
     </w:p>
     <w:p>
@@ -1166,6 +1107,9 @@
         </w:rPr>
         <w:t>cd C:\Lab</w:t>
         <w:br/>
+        <w:t>git clone --branch codex/v2 --single-branch https://github.com/min5921/lidar_labeling.git</w:t>
+        <w:br/>
+        <w:t>cd lidar_labeling</w:t>
       </w:r>
       <w:r>
         <w:rPr>
@@ -1173,8 +1117,6 @@
           <w:color w:val="EAF2F8"/>
           <w:sz w:val="17"/>
         </w:rPr>
-        <w:t>git clone https://github.com/min5921/lidar_labeling.git</w:t>
-        <w:br/>
       </w:r>
       <w:r>
         <w:rPr>
@@ -1182,7 +1124,6 @@
           <w:color w:val="EAF2F8"/>
           <w:sz w:val="17"/>
         </w:rPr>
-        <w:t>cd lidar_labeling</w:t>
       </w:r>
     </w:p>
     <w:p>
@@ -1250,8 +1191,9 @@
           <w:color w:val="EAF2F8"/>
           <w:sz w:val="17"/>
         </w:rPr>
-        <w:t>.\setup_windows.bat</w:t>
+        <w:t>.\launchers\windows\setup_windows.bat</w:t>
         <w:br/>
+        <w:t>.\launchers\windows\run_windows.bat</w:t>
       </w:r>
       <w:r>
         <w:rPr>
@@ -1259,7 +1201,6 @@
           <w:color w:val="EAF2F8"/>
           <w:sz w:val="17"/>
         </w:rPr>
-        <w:t>.\run_windows.bat</w:t>
       </w:r>
     </w:p>
     <w:p>
@@ -1267,7 +1208,7 @@
         <w:rPr>
           <w:rFonts w:ascii="Malgun Gothic" w:hAnsi="Malgun Gothic" w:eastAsia="Malgun Gothic"/>
         </w:rPr>
-        <w:t>setup_windows.bat은 .venv를 만들고 고정된 package를 설치한 뒤 환경을 검증합니다. 마지막에 [OK] LiDAR Label Tool source environment verified가 표시되어야 합니다.</w:t>
+        <w:t>setup_windows.bat은 공식 CPython으로 .venv를 만들고 고정 package를 설치한 뒤 QtCore/QtGui/QtWidgets native DLL까지 검증합니다. 마지막에 [OK] LiDAR Label Tool source environment verified가 표시되어야 합니다.</w:t>
       </w:r>
     </w:p>
     <w:p>
@@ -1291,10 +1232,11 @@
       <w:r>
         <w:rPr>
           <w:rFonts w:ascii="Malgun Gothic" w:hAnsi="Malgun Gothic" w:eastAsia="Malgun Gothic"/>
+          <w:b w:val="0"/>
           <w:color w:val="243447"/>
           <w:sz w:val="21"/>
         </w:rPr>
-        <w:t>자동 탐색이 실패하면 ./setup_windows.bat -PythonCommand C:/Python310/python.exe 형식으로 Python 위치를 지정합니다.</w:t>
+        <w:t>자동 탐색이 실패하면 .\launchers\windows\setup_windows.bat -PythonCommand C:\Python312\python.exe 형식으로 공식 Python 위치를 지정합니다.</w:t>
       </w:r>
     </w:p>
     <w:p>
@@ -1403,6 +1345,9 @@
         </w:rPr>
         <w:t>mkdir -p ~/lab &amp;&amp; cd ~/lab</w:t>
         <w:br/>
+        <w:t>git clone --branch codex/v2 --single-branch https://github.com/min5921/lidar_labeling.git</w:t>
+        <w:br/>
+        <w:t>cd lidar_labeling</w:t>
       </w:r>
       <w:r>
         <w:rPr>
@@ -1410,8 +1355,6 @@
           <w:color w:val="EAF2F8"/>
           <w:sz w:val="17"/>
         </w:rPr>
-        <w:t>git clone https://github.com/min5921/lidar_labeling.git</w:t>
-        <w:br/>
       </w:r>
       <w:r>
         <w:rPr>
@@ -1419,7 +1362,6 @@
           <w:color w:val="EAF2F8"/>
           <w:sz w:val="17"/>
         </w:rPr>
-        <w:t>cd lidar_labeling</w:t>
       </w:r>
     </w:p>
     <w:p>
@@ -1452,8 +1394,11 @@
           <w:color w:val="EAF2F8"/>
           <w:sz w:val="17"/>
         </w:rPr>
-        <w:t>chmod +x setup_linux.sh run_linux.sh</w:t>
+        <w:t>chmod +x launchers/linux/setup_linux.sh launchers/linux/run_linux.sh</w:t>
         <w:br/>
+        <w:t>./launchers/linux/setup_linux.sh</w:t>
+        <w:br/>
+        <w:t>./launchers/linux/run_linux.sh</w:t>
       </w:r>
       <w:r>
         <w:rPr>
@@ -1461,8 +1406,6 @@
           <w:color w:val="EAF2F8"/>
           <w:sz w:val="17"/>
         </w:rPr>
-        <w:t>./setup_linux.sh</w:t>
-        <w:br/>
       </w:r>
       <w:r>
         <w:rPr>
@@ -1470,7 +1413,6 @@
           <w:color w:val="EAF2F8"/>
           <w:sz w:val="17"/>
         </w:rPr>
-        <w:t>./run_linux.sh</w:t>
       </w:r>
     </w:p>
     <w:p>
@@ -1494,10 +1436,11 @@
       <w:r>
         <w:rPr>
           <w:rFonts w:ascii="Malgun Gothic" w:hAnsi="Malgun Gothic" w:eastAsia="Malgun Gothic"/>
+          <w:b w:val="0"/>
           <w:color w:val="243447"/>
           <w:sz w:val="21"/>
         </w:rPr>
-        <w:t>다른 Python을 사용할 때는 PYTHON_BIN=python3.12 ./setup_linux.sh처럼 지정합니다.</w:t>
+        <w:t>다른 Python을 사용할 때는 PYTHON_BIN=python3.12 ./launchers/linux/setup_linux.sh처럼 지정합니다.</w:t>
       </w:r>
     </w:p>
     <w:p>
@@ -1582,6 +1525,19 @@
         </w:rPr>
         <w:t>git status</w:t>
         <w:br/>
+        <w:t>git fetch origin</w:t>
+        <w:br/>
+        <w:t>git switch codex/v2</w:t>
+        <w:br/>
+        <w:t>git pull --ff-only origin codex/v2</w:t>
+        <w:br/>
+        <w:t># Windows</w:t>
+        <w:br/>
+        <w:t>.\launchers\windows\setup_windows.bat</w:t>
+        <w:br/>
+        <w:t># Linux</w:t>
+        <w:br/>
+        <w:t>./launchers/linux/setup_linux.sh</w:t>
       </w:r>
       <w:r>
         <w:rPr>
@@ -1589,8 +1545,6 @@
           <w:color w:val="EAF2F8"/>
           <w:sz w:val="17"/>
         </w:rPr>
-        <w:t>git pull</w:t>
-        <w:br/>
       </w:r>
       <w:r>
         <w:rPr>
@@ -1598,8 +1552,6 @@
           <w:color w:val="EAF2F8"/>
           <w:sz w:val="17"/>
         </w:rPr>
-        <w:t># Windows</w:t>
-        <w:br/>
       </w:r>
       <w:r>
         <w:rPr>
@@ -1607,8 +1559,6 @@
           <w:color w:val="EAF2F8"/>
           <w:sz w:val="17"/>
         </w:rPr>
-        <w:t>.\setup_windows.bat</w:t>
-        <w:br/>
       </w:r>
       <w:r>
         <w:rPr>
@@ -1616,8 +1566,6 @@
           <w:color w:val="EAF2F8"/>
           <w:sz w:val="17"/>
         </w:rPr>
-        <w:t># Linux</w:t>
-        <w:br/>
       </w:r>
       <w:r>
         <w:rPr>
@@ -1625,7 +1573,6 @@
           <w:color w:val="EAF2F8"/>
           <w:sz w:val="17"/>
         </w:rPr>
-        <w:t>./setup_linux.sh</w:t>
       </w:r>
     </w:p>
     <w:p>
@@ -1693,8 +1640,19 @@
           <w:color w:val="EAF2F8"/>
           <w:sz w:val="17"/>
         </w:rPr>
-        <w:t>conda create --name lidar-label-tool python=3.10 pip</w:t>
+        <w:t>conda create --name lidar-label-tool python=3.12 pip</w:t>
         <w:br/>
+        <w:t>conda activate lidar-label-tool</w:t>
+        <w:br/>
+        <w:t>python -m pip install -r requirements-bootstrap-lock.txt</w:t>
+        <w:br/>
+        <w:t>python -m pip install -r requirements-lock.txt</w:t>
+        <w:br/>
+        <w:t>python -m pip install --no-build-isolation --no-deps -e .</w:t>
+        <w:br/>
+        <w:t>python scripts/verify_source_environment.py</w:t>
+        <w:br/>
+        <w:t>python -m lidar_label_tool gui</w:t>
       </w:r>
       <w:r>
         <w:rPr>
@@ -1702,8 +1660,6 @@
           <w:color w:val="EAF2F8"/>
           <w:sz w:val="17"/>
         </w:rPr>
-        <w:t>conda activate lidar-label-tool</w:t>
-        <w:br/>
       </w:r>
       <w:r>
         <w:rPr>
@@ -1711,8 +1667,6 @@
           <w:color w:val="EAF2F8"/>
           <w:sz w:val="17"/>
         </w:rPr>
-        <w:t>python -m pip install -r requirements-bootstrap-lock.txt</w:t>
-        <w:br/>
       </w:r>
       <w:r>
         <w:rPr>
@@ -1720,8 +1674,6 @@
           <w:color w:val="EAF2F8"/>
           <w:sz w:val="17"/>
         </w:rPr>
-        <w:t>python -m pip install -r requirements-lock.txt</w:t>
-        <w:br/>
       </w:r>
       <w:r>
         <w:rPr>
@@ -1729,8 +1681,6 @@
           <w:color w:val="EAF2F8"/>
           <w:sz w:val="17"/>
         </w:rPr>
-        <w:t>python -m pip install --no-build-isolation --no-deps -e .</w:t>
-        <w:br/>
       </w:r>
       <w:r>
         <w:rPr>
@@ -1738,8 +1688,6 @@
           <w:color w:val="EAF2F8"/>
           <w:sz w:val="17"/>
         </w:rPr>
-        <w:t>python scripts/verify_source_environment.py</w:t>
-        <w:br/>
       </w:r>
       <w:r>
         <w:rPr>
@@ -1747,7 +1695,6 @@
           <w:color w:val="EAF2F8"/>
           <w:sz w:val="17"/>
         </w:rPr>
-        <w:t>python -m lidar_label_tool gui</w:t>
       </w:r>
     </w:p>
     <w:p>
@@ -1771,10 +1718,11 @@
       <w:r>
         <w:rPr>
           <w:rFonts w:ascii="Malgun Gothic" w:hAnsi="Malgun Gothic" w:eastAsia="Malgun Gothic"/>
+          <w:b w:val="0"/>
           <w:color w:val="243447"/>
           <w:sz w:val="21"/>
         </w:rPr>
-        <w:t>.venv가 활성화된 상태에서 Conda를 겹쳐 사용하지 않습니다. 한 PC에서 두 방식은 가능하지만 한 번의 실행에는 하나의 환경만 사용합니다.</w:t>
+        <w:t>새 Windows PC의 기본 경로는 공식 Python 기반 .venv입니다. Conda 대안을 선택했다면 Windows venv launcher와 섞지 않습니다.</w:t>
       </w:r>
     </w:p>
     <w:p>
@@ -1797,7 +1745,7 @@
         <w:rPr>
           <w:rFonts w:ascii="Malgun Gothic" w:hAnsi="Malgun Gothic" w:eastAsia="Malgun Gothic"/>
         </w:rPr>
-        <w:t>run script를 실행하면 통합 작업 선택 화면이 열립니다. 목적에 따라 아래 기능을 선택합니다.</w:t>
+        <w:t>run launcher를 실행하면 통합 작업 선택 화면이 열립니다. 범용 v2 작업은 위쪽 기본 영역을 사용하고 one_chip 변환은 접힌 레거시 영역에서만 사용합니다.</w:t>
       </w:r>
     </w:p>
     <w:p>
@@ -1810,13 +1758,14 @@
           <w:b/>
           <w:color w:val="2E74B5"/>
         </w:rPr>
-        <w:t xml:space="preserve">데이터셋 열기: </w:t>
+        <w:t xml:space="preserve">데이터 폴더/데이터셋 열기: </w:t>
       </w:r>
       <w:r>
         <w:rPr>
           <w:rFonts w:ascii="Malgun Gothic" w:hAnsi="Malgun Gothic" w:eastAsia="Malgun Gothic"/>
+          <w:b w:val="0"/>
         </w:rPr>
-        <w:t>이미 변환된 dataset.json 폴더를 GUI로 엽니다.</w:t>
+        <w:t>기존 dataset을 열거나 JSON이 없는 LiDAR 폴더를 범용 v2로 구성합니다.</w:t>
       </w:r>
     </w:p>
     <w:p>
@@ -1829,13 +1778,14 @@
           <w:b/>
           <w:color w:val="2E74B5"/>
         </w:rPr>
-        <w:t xml:space="preserve">원본 데이터 변환: </w:t>
+        <w:t xml:space="preserve">범용 v2 재동기화: </w:t>
       </w:r>
       <w:r>
         <w:rPr>
           <w:rFonts w:ascii="Malgun Gothic" w:hAnsi="Malgun Gothic" w:eastAsia="Malgun Gothic"/>
+          <w:b w:val="0"/>
         </w:rPr>
-        <w:t>calibration + rosbags를 새 device-centric dataset으로 변환합니다.</w:t>
+        <w:t>point/image 원본은 유지하고 검증된 새 frame-index generation을 만듭니다.</w:t>
       </w:r>
     </w:p>
     <w:p>
@@ -1848,51 +1798,14 @@
           <w:b/>
           <w:color w:val="2E74B5"/>
         </w:rPr>
-        <w:t xml:space="preserve">기존 데이터 재동기화: </w:t>
+        <w:t xml:space="preserve">범용 v2 LiDAR profile 추가: </w:t>
       </w:r>
       <w:r>
         <w:rPr>
           <w:rFonts w:ascii="Malgun Gothic" w:hAnsi="Malgun Gothic" w:eastAsia="Malgun Gothic"/>
+          <w:b w:val="0"/>
         </w:rPr>
-        <w:t>이미지·포인트는 유지하고 sync/frames.jsonl만 다시 만듭니다.</w:t>
-      </w:r>
-    </w:p>
-    <w:p>
-      <w:pPr>
-        <w:spacing w:after="100"/>
-      </w:pPr>
-      <w:r>
-        <w:rPr>
-          <w:rFonts w:ascii="Malgun Gothic" w:hAnsi="Malgun Gothic" w:eastAsia="Malgun Gothic"/>
-          <w:b/>
-          <w:color w:val="2E74B5"/>
-        </w:rPr>
-        <w:t xml:space="preserve">Calibration JSON 생성: </w:t>
-      </w:r>
-      <w:r>
-        <w:rPr>
-          <w:rFonts w:ascii="Malgun Gothic" w:hAnsi="Malgun Gothic" w:eastAsia="Malgun Gothic"/>
-        </w:rPr>
-        <w:t>YAML에서 calibration/calibration.json을 만듭니다.</w:t>
-      </w:r>
-    </w:p>
-    <w:p>
-      <w:pPr>
-        <w:spacing w:after="100"/>
-      </w:pPr>
-      <w:r>
-        <w:rPr>
-          <w:rFonts w:ascii="Malgun Gothic" w:hAnsi="Malgun Gothic" w:eastAsia="Malgun Gothic"/>
-          <w:b/>
-          <w:color w:val="2E74B5"/>
-        </w:rPr>
-        <w:t xml:space="preserve">Calibration 검증: </w:t>
-      </w:r>
-      <w:r>
-        <w:rPr>
-          <w:rFonts w:ascii="Malgun Gothic" w:hAnsi="Malgun Gothic" w:eastAsia="Malgun Gothic"/>
-        </w:rPr>
-        <w:t>원본 YAML 대조와 projection overlay를 확인합니다.</w:t>
+        <w:t>기존 dataset ID와 라벨을 유지하며 다른 LiDAR를 독립 profile로 추가합니다.</w:t>
       </w:r>
     </w:p>
     <w:p>
@@ -1910,8 +1823,9 @@
       <w:r>
         <w:rPr>
           <w:rFonts w:ascii="Malgun Gothic" w:hAnsi="Malgun Gothic" w:eastAsia="Malgun Gothic"/>
+          <w:b w:val="0"/>
         </w:rPr>
-        <w:t>포인트·이미지·sync·calibration·라벨 상태를 읽기 전용 검사합니다.</w:t>
+        <w:t>point·image·sync·calibration·라벨을 읽기 전용으로 검사합니다.</w:t>
       </w:r>
     </w:p>
     <w:p>
@@ -1929,8 +1843,9 @@
       <w:r>
         <w:rPr>
           <w:rFonts w:ascii="Malgun Gothic" w:hAnsi="Malgun Gothic" w:eastAsia="Malgun Gothic"/>
+          <w:b w:val="0"/>
         </w:rPr>
-        <w:t>source/working 라벨 수와 class 분포를 확인합니다.</w:t>
+        <w:t>source/working label 수와 class 분포를 확인합니다.</w:t>
       </w:r>
     </w:p>
     <w:p>
@@ -1948,8 +1863,49 @@
       <w:r>
         <w:rPr>
           <w:rFonts w:ascii="Malgun Gothic" w:hAnsi="Malgun Gothic" w:eastAsia="Malgun Gothic"/>
+          <w:b w:val="0"/>
         </w:rPr>
-        <w:t>저장과 분리된 명시적 export를 실행합니다.</w:t>
+        <w:t>일반 저장과 분리된 명시적 export를 실행합니다.</w:t>
+      </w:r>
+    </w:p>
+    <w:p>
+      <w:pPr>
+        <w:spacing w:after="100"/>
+      </w:pPr>
+      <w:r>
+        <w:rPr>
+          <w:rFonts w:ascii="Malgun Gothic" w:hAnsi="Malgun Gothic" w:eastAsia="Malgun Gothic"/>
+          <w:b/>
+          <w:color w:val="2E74B5"/>
+        </w:rPr>
+        <w:t xml:space="preserve">Calibration 편집기: </w:t>
+      </w:r>
+      <w:r>
+        <w:rPr>
+          <w:rFonts w:ascii="Malgun Gothic" w:hAnsi="Malgun Gothic" w:eastAsia="Malgun Gothic"/>
+          <w:b w:val="0"/>
+        </w:rPr>
+        <w:t>별도 run_calibration launcher로 조정본을 원본과 분리해 저장합니다.</w:t>
+      </w:r>
+    </w:p>
+    <w:p>
+      <w:pPr>
+        <w:spacing w:after="100"/>
+      </w:pPr>
+      <w:r>
+        <w:rPr>
+          <w:rFonts w:ascii="Malgun Gothic" w:hAnsi="Malgun Gothic" w:eastAsia="Malgun Gothic"/>
+          <w:b/>
+          <w:color w:val="2E74B5"/>
+        </w:rPr>
+        <w:t xml:space="preserve">one_chip 레거시: </w:t>
+      </w:r>
+      <w:r>
+        <w:rPr>
+          <w:rFonts w:ascii="Malgun Gothic" w:hAnsi="Malgun Gothic" w:eastAsia="Malgun Gothic"/>
+          <w:b w:val="0"/>
+        </w:rPr>
+        <w:t>특정 calibration + rosbags 변환·검증 기능만 접힌 고급 영역에서 사용합니다.</w:t>
       </w:r>
     </w:p>
     <w:p>
@@ -1973,10 +1929,11 @@
       <w:r>
         <w:rPr>
           <w:rFonts w:ascii="Malgun Gothic" w:hAnsi="Malgun Gothic" w:eastAsia="Malgun Gothic"/>
+          <w:b w:val="0"/>
           <w:color w:val="243447"/>
           <w:sz w:val="21"/>
         </w:rPr>
-        <w:t>변환된 폴더가 있으면 '데이터셋 검사'를 먼저 실행한 뒤 '데이터셋 열기'를 선택합니다.</w:t>
+        <w:t>일반 BIN/PCD 폴더는 '데이터 폴더/데이터셋 열기'에서 선택하고, 구성 분석 결과를 확인한 뒤 JSON/index를 생성합니다.</w:t>
       </w:r>
     </w:p>
     <w:p>
@@ -1999,7 +1956,7 @@
         <w:rPr>
           <w:rFonts w:ascii="Malgun Gothic" w:hAnsi="Malgun Gothic" w:eastAsia="Malgun Gothic"/>
         </w:rPr>
-        <w:t>Git clone으로 받는 폴더에는 프로그램 코드와 setup/run 파일만 둡니다. setup을 실행하면 .venv가 자동 생성되며 Git에는 포함되지 않습니다.</w:t>
+        <w:t>Git clone으로 받는 폴더에는 프로그램 코드와 launchers를 둡니다. setup을 실행하면 .venv가 자동 생성되며 Git에는 포함되지 않습니다.</w:t>
       </w:r>
     </w:p>
     <w:p>
@@ -2055,7 +2012,7 @@
           <w:color w:val="667788"/>
           <w:sz w:val="18"/>
         </w:rPr>
-        <w:t>그림 2. 저장소에서 사용자가 주로 보는 파일과 폴더</w:t>
+        <w:t>그림 2. 현재 저장소에서 사용자가 주로 보는 파일과 폴더</w:t>
       </w:r>
     </w:p>
     <w:p>
@@ -2079,10 +2036,11 @@
       <w:r>
         <w:rPr>
           <w:rFonts w:ascii="Malgun Gothic" w:hAnsi="Malgun Gothic" w:eastAsia="Malgun Gothic"/>
+          <w:b w:val="0"/>
           <w:color w:val="243447"/>
           <w:sz w:val="21"/>
         </w:rPr>
-        <w:t>다른 원본·출력 경로를 사용하려고 코드를 복사할 필요는 없습니다. GUI에서 경로를 선택하거나 scripts/convert_one_chip_dataset.py 상단의 User-editable defaults를 수정합니다.</w:t>
+        <w:t>원본과 configuration/label workspace 경로는 GUI에서 선택합니다. 경로를 바꾸기 위해 코드를 복사하거나 수정하지 않습니다.</w:t>
       </w:r>
     </w:p>
     <w:p>
@@ -2097,7 +2055,7 @@
           <w:color w:val="2E74B5"/>
           <w:sz w:val="32"/>
         </w:rPr>
-        <w:t>7. 데이터 파일 구조</w:t>
+        <w:t>7. 범용 v2 데이터 파일 구조</w:t>
       </w:r>
     </w:p>
     <w:p>
@@ -2105,7 +2063,7 @@
         <w:rPr>
           <w:rFonts w:ascii="Malgun Gothic" w:hAnsi="Malgun Gothic" w:eastAsia="Malgun Gothic"/>
         </w:rPr>
-        <w:t>원본 one_chip과 변환 결과는 저장소 밖에 둡니다. 아래 구조에서 dataset.json이 있는 one_chip_converted 폴더가 GUI에서 선택할 데이터셋 루트입니다.</w:t>
+        <w:t>BIN/PCD, image, timestamp CSV와 선택적 calibration은 저장소 밖에 둡니다. 프로그램은 원본을 수정하지 않고 같은 폴더 또는 별도 workspace에 dataset.json, generation index와 작업 라벨을 생성합니다.</w:t>
       </w:r>
     </w:p>
     <w:p>
@@ -2161,7 +2119,7 @@
           <w:color w:val="667788"/>
           <w:sz w:val="18"/>
         </w:rPr>
-        <w:t>그림 3. 원본 취득 데이터와 현재 기본 변환 데이터셋 구조</w:t>
+        <w:t>그림 3. 범용 v2 원본과 프로그램 생성 구성·라벨 구조</w:t>
       </w:r>
     </w:p>
     <w:p>
@@ -2180,15 +2138,16 @@
           <w:color w:val="B7791F"/>
           <w:sz w:val="21"/>
         </w:rPr>
-        <w:t xml:space="preserve">논리 센서 ID  </w:t>
+        <w:t xml:space="preserve">프로그램 생성 파일  </w:t>
       </w:r>
       <w:r>
         <w:rPr>
           <w:rFonts w:ascii="Malgun Gothic" w:hAnsi="Malgun Gothic" w:eastAsia="Malgun Gothic"/>
+          <w:b w:val="0"/>
           <w:color w:val="243447"/>
           <w:sz w:val="21"/>
         </w:rPr>
-        <w:t>MERGED, CAM_LEFT, CAM_RIGHT는 폴더명이 아니라 dataset.json 안의 논리 ID입니다. 현재 기본 실제 폴더명은 lidar, cam_left, cam_right입니다.</w:t>
+        <w:t>dataset.json은 활성 generation을 가리키고, profile별 *.frames.jsonl은 LiDAR 순서와 선택적 camera 연결을 확정합니다.</w:t>
       </w:r>
     </w:p>
     <w:p>
@@ -2207,15 +2166,16 @@
           <w:color w:val="2E74B5"/>
           <w:sz w:val="21"/>
         </w:rPr>
-        <w:t xml:space="preserve">기존 legacy 구조  </w:t>
+        <w:t xml:space="preserve">레거시 호환  </w:t>
       </w:r>
       <w:r>
         <w:rPr>
           <w:rFonts w:ascii="Malgun Gothic" w:hAnsi="Malgun Gothic" w:eastAsia="Malgun Gothic"/>
+          <w:b w:val="0"/>
           <w:color w:val="243447"/>
           <w:sz w:val="21"/>
         </w:rPr>
-        <w:t>sensors/lidar/MERGED/frames와 sensors/camera/... 구조의 기존 변환본도 manifest의 data_patterns를 통해 계속 열 수 있습니다.</w:t>
+        <w:t>기존 v1 MERGED, Waymo frame 중심과 one_chip 결과는 계속 열 수 있지만 새 범용 구성의 기본 구조는 아닙니다.</w:t>
       </w:r>
     </w:p>
     <w:p>
@@ -2230,7 +2190,7 @@
           <w:color w:val="2E74B5"/>
           <w:sz w:val="32"/>
         </w:rPr>
-        <w:t>8. 변환된 데이터셋 열기와 검수</w:t>
+        <w:t>8. 범용 v2 구성·열기와 검수</w:t>
       </w:r>
     </w:p>
     <w:p>
@@ -2244,7 +2204,7 @@
           <w:color w:val="2E74B5"/>
           <w:sz w:val="26"/>
         </w:rPr>
-        <w:t>8.1 Preflight</w:t>
+        <w:t>8.1 구성 분석과 Preflight</w:t>
       </w:r>
     </w:p>
     <w:p>
@@ -2252,7 +2212,7 @@
         <w:rPr>
           <w:rFonts w:ascii="Malgun Gothic" w:hAnsi="Malgun Gothic" w:eastAsia="Malgun Gothic"/>
         </w:rPr>
-        <w:t>GUI의 '데이터셋 검사' 또는 다음 명령으로 전체 구조를 먼저 확인합니다.</w:t>
+        <w:t>dataset.json이 없는 원본 폴더는 GUI의 구성 분석을 먼저 실행합니다. 이미 구성된 데이터는 '데이터셋 검사' 또는 다음 명령으로 확인합니다.</w:t>
       </w:r>
     </w:p>
     <w:p>
@@ -2273,6 +2233,14 @@
         </w:rPr>
         <w:t># Windows</w:t>
         <w:br/>
+        <w:t>.\.venv\Scripts\python.exe -m lidar_label_tool validate-v2 D:\data\my_dataset</w:t>
+        <w:br/>
+        <w:t>.\.venv\Scripts\python.exe -m lidar_label_tool preflight D:\data\my_dataset</w:t>
+        <w:br/>
+        <w:br/>
+        <w:t># Linux</w:t>
+        <w:br/>
+        <w:t>./.venv/bin/python -m lidar_label_tool preflight /data/my_dataset</w:t>
       </w:r>
       <w:r>
         <w:rPr>
@@ -2280,8 +2248,6 @@
           <w:color w:val="EAF2F8"/>
           <w:sz w:val="17"/>
         </w:rPr>
-        <w:t>.\.venv\Scripts\python.exe -m lidar_label_tool preflight E:\one_chip_converted</w:t>
-        <w:br/>
       </w:r>
       <w:r>
         <w:rPr>
@@ -2289,7 +2255,6 @@
           <w:color w:val="EAF2F8"/>
           <w:sz w:val="17"/>
         </w:rPr>
-        <w:br/>
       </w:r>
       <w:r>
         <w:rPr>
@@ -2297,8 +2262,6 @@
           <w:color w:val="EAF2F8"/>
           <w:sz w:val="17"/>
         </w:rPr>
-        <w:t># Linux</w:t>
-        <w:br/>
       </w:r>
       <w:r>
         <w:rPr>
@@ -2306,7 +2269,6 @@
           <w:color w:val="EAF2F8"/>
           <w:sz w:val="17"/>
         </w:rPr>
-        <w:t>./.venv/bin/python -m lidar_label_tool preflight /data/one_chip_converted</w:t>
       </w:r>
     </w:p>
     <w:p>
@@ -2361,7 +2323,7 @@
           <w:color w:val="2E74B5"/>
           <w:sz w:val="26"/>
         </w:rPr>
-        <w:t>8.2 GUI에서 열기</w:t>
+        <w:t>8.2 GUI에서 구성하거나 열기</w:t>
       </w:r>
     </w:p>
     <w:p>
@@ -2376,7 +2338,7 @@
         <w:rPr>
           <w:rFonts w:ascii="Malgun Gothic" w:hAnsi="Malgun Gothic" w:eastAsia="Malgun Gothic"/>
         </w:rPr>
-        <w:t>통합 화면에서 '데이터셋 열기'를 선택합니다.</w:t>
+        <w:t>통합 화면에서 '데이터 폴더/데이터셋 열기'를 선택합니다.</w:t>
       </w:r>
     </w:p>
     <w:p>
@@ -2391,7 +2353,7 @@
         <w:rPr>
           <w:rFonts w:ascii="Malgun Gothic" w:hAnsi="Malgun Gothic" w:eastAsia="Malgun Gothic"/>
         </w:rPr>
-        <w:t>dataset.json이 직접 들어 있는 폴더를 선택합니다.</w:t>
+        <w:t>dataset.json이 없으면 원본 root에서 LiDAR 후보, point columns, 좌표계, 선택적 camera와 timestamp를 확인한 뒤 구성 분석→검증 결과로 생성을 실행합니다.</w:t>
       </w:r>
     </w:p>
     <w:p>
@@ -2406,7 +2368,7 @@
         <w:rPr>
           <w:rFonts w:ascii="Malgun Gothic" w:hAnsi="Malgun Gothic" w:eastAsia="Malgun Gothic"/>
         </w:rPr>
-        <w:t>frame 수, MERGED, CAM_LEFT/CAM_RIGHT, 작업 저장 위치를 확인합니다.</w:t>
+        <w:t>구성된 v2를 열 때 profile 하나를 선택하고 frame 수, 활성 LiDAR 하나, camera 0~1개와 작업 저장 위치를 확인합니다.</w:t>
       </w:r>
     </w:p>
     <w:p>
@@ -2421,7 +2383,7 @@
         <w:rPr>
           <w:rFonts w:ascii="Malgun Gothic" w:hAnsi="Malgun Gothic" w:eastAsia="Malgun Gothic"/>
         </w:rPr>
-        <w:t>오류가 없으면 계속 진행하고 3D·카메라 화면을 확인합니다.</w:t>
+        <w:t>camera나 calibration이 없어도 정상 LiDAR frame을 열고 저장할 수 있는지 확인합니다.</w:t>
       </w:r>
     </w:p>
     <w:p>
@@ -2496,7 +2458,7 @@
           <w:color w:val="A33A3A"/>
           <w:sz w:val="21"/>
         </w:rPr>
-        <w:t xml:space="preserve">선택하면 안 되는 폴더  </w:t>
+        <w:t>ZIP 파일은 직접 열지 않습니다. 여러 데이터셋이 섞인 상위 폴더 대신 실제 sensor 원본 root 또는 dataset.json이 있는 configuration root를 선택합니다.</w:t>
       </w:r>
       <w:r>
         <w:rPr>
@@ -2504,7 +2466,6 @@
           <w:color w:val="243447"/>
           <w:sz w:val="21"/>
         </w:rPr>
-        <w:t>ZIP 파일, one_chip 원본 폴더, rosbags 하위 폴더 또는 dataset.json의 상위 폴더를 데이터셋으로 선택하지 않습니다.</w:t>
       </w:r>
     </w:p>
     <w:p>
@@ -2519,7 +2480,7 @@
           <w:color w:val="2E74B5"/>
           <w:sz w:val="32"/>
         </w:rPr>
-        <w:t>9. 원본 one_chip을 새로 변환</w:t>
+        <w:t>9. one_chip 원본을 새로 변환 (레거시 전용)</w:t>
       </w:r>
     </w:p>
     <w:p>
@@ -2533,7 +2494,7 @@
           <w:color w:val="2E74B5"/>
           <w:sz w:val="26"/>
         </w:rPr>
-        <w:t>9.1 GUI 권장 절차</w:t>
+        <w:t>9.1 레거시 GUI 절차</w:t>
       </w:r>
     </w:p>
     <w:p>
@@ -2548,7 +2509,7 @@
         <w:rPr>
           <w:rFonts w:ascii="Malgun Gothic" w:hAnsi="Malgun Gothic" w:eastAsia="Malgun Gothic"/>
         </w:rPr>
-        <w:t>통합 화면에서 '원본 데이터 변환'을 선택합니다.</w:t>
+        <w:t>통합 화면의 '고급 도구 — one_chip 레거시 전용'을 펼치고 'one_chip MCAP/ROS bag 변환'을 선택합니다.</w:t>
       </w:r>
     </w:p>
     <w:p>
@@ -2809,15 +2770,16 @@
           <w:color w:val="B7791F"/>
           <w:sz w:val="21"/>
         </w:rPr>
-        <w:t xml:space="preserve">반드시 백업  </w:t>
+        <w:t xml:space="preserve">레거시 백업  </w:t>
       </w:r>
       <w:r>
         <w:rPr>
           <w:rFonts w:ascii="Malgun Gothic" w:hAnsi="Malgun Gothic" w:eastAsia="Malgun Gothic"/>
+          <w:b w:val="0"/>
           <w:color w:val="243447"/>
           <w:sz w:val="21"/>
         </w:rPr>
-        <w:t>재동기화 전 sync/frames.jsonl을 복사해 둡니다. frame 2991~3005처럼 알려진 구간에서 camera sample이 자연스럽게 증가하는지 확인합니다.</w:t>
+        <w:t>one_chip 재동기화는 기존 sync/frames.jsonl을 백업합니다. 범용 v2는 이전 generation을 보존한 채 새 generation을 활성화합니다.</w:t>
       </w:r>
     </w:p>
     <w:p>
@@ -2857,7 +2819,7 @@
         <w:rPr>
           <w:rFonts w:ascii="Malgun Gothic" w:hAnsi="Malgun Gothic" w:eastAsia="Malgun Gothic"/>
         </w:rPr>
-        <w:t>reference_frame은 robosense 또는 LiDAR 기준입니다.</w:t>
+        <w:t>범용 v2 label reference frame은 선택 profile의 활성 LiDAR coordinate frame입니다.</w:t>
       </w:r>
     </w:p>
     <w:p>
@@ -2868,7 +2830,7 @@
         <w:rPr>
           <w:rFonts w:ascii="Malgun Gothic" w:hAnsi="Malgun Gothic" w:eastAsia="Malgun Gothic"/>
         </w:rPr>
-        <w:t>MERGED LiDAR의 reference transform은 identity입니다.</w:t>
+        <w:t>앱은 여러 LiDAR를 자동 병합하거나 동시에 box fitting에 사용하지 않습니다.</w:t>
       </w:r>
     </w:p>
     <w:p>
@@ -2879,7 +2841,7 @@
         <w:rPr>
           <w:rFonts w:ascii="Malgun Gothic" w:hAnsi="Malgun Gothic" w:eastAsia="Malgun Gothic"/>
         </w:rPr>
-        <w:t>CAM_LEFT/CAM_RIGHT의 T_camera_reference에는 LiDAR→camera transform이 들어갑니다.</w:t>
+        <w:t>calibrated camera의 T_camera_reference는 활성 LiDAR/reference에서 camera로 가는 transform입니다.</w:t>
       </w:r>
     </w:p>
     <w:p>
@@ -2890,7 +2852,7 @@
         <w:rPr>
           <w:rFonts w:ascii="Malgun Gothic" w:hAnsi="Malgun Gothic" w:eastAsia="Malgun Gothic"/>
         </w:rPr>
-        <w:t>plumb_bob distortion은 brown_conrady로 매핑합니다.</w:t>
+        <w:t>camera 또는 calibration이 없거나 손상되어도 LiDAR 라벨링과 저장은 계속합니다.</w:t>
       </w:r>
     </w:p>
     <w:p>
@@ -2914,10 +2876,11 @@
       <w:r>
         <w:rPr>
           <w:rFonts w:ascii="Malgun Gothic" w:hAnsi="Malgun Gothic" w:eastAsia="Malgun Gothic"/>
+          <w:b w:val="0"/>
           <w:color w:val="243447"/>
           <w:sz w:val="21"/>
         </w:rPr>
-        <w:t>Calibration JSON 구조가 유효하다는 것만으로 실제 정렬이 보장되지는 않습니다. 좌·우 카메라 projection overlay와 정지 물체의 모서리를 시각적으로 함께 확인합니다.</w:t>
+        <w:t>Calibration JSON 구조가 유효하다는 것만으로 실제 정렬이 보장되지는 않습니다. 선택 camera projection과 정지 구조물의 모서리를 시각적으로 확인합니다.</w:t>
       </w:r>
     </w:p>
     <w:p>
@@ -2950,8 +2913,11 @@
           <w:color w:val="EAF2F8"/>
           <w:sz w:val="17"/>
         </w:rPr>
-        <w:t>&lt;dataset&gt;/annotations/lidar_label_tool/&lt;frame_id&gt;.json</w:t>
+        <w:t>&lt;configuration-root&gt;/annotations/lidar_label_tool/&lt;profile&gt;/&lt;lidar&gt;/&lt;frame&gt;.json</w:t>
         <w:br/>
+        <w:t>&lt;working-label&gt;.json.bak</w:t>
+        <w:br/>
+        <w:t>&lt;label-namespace&gt;/.recovery/</w:t>
       </w:r>
       <w:r>
         <w:rPr>
@@ -2959,8 +2925,6 @@
           <w:color w:val="EAF2F8"/>
           <w:sz w:val="17"/>
         </w:rPr>
-        <w:t>&lt;dataset&gt;/annotations/lidar_label_tool/&lt;frame_id&gt;.json.bak</w:t>
-        <w:br/>
       </w:r>
       <w:r>
         <w:rPr>
@@ -2968,7 +2932,6 @@
           <w:color w:val="EAF2F8"/>
           <w:sz w:val="17"/>
         </w:rPr>
-        <w:t>&lt;dataset&gt;/annotations/lidar_label_tool/.recovery/</w:t>
       </w:r>
     </w:p>
     <w:p>
@@ -3131,15 +3094,8 @@
             <w:vAlign w:val="center"/>
           </w:tcPr>
           <w:p>
-            <w:pPr>
-              <w:spacing w:before="0" w:after="0"/>
-            </w:pPr>
             <w:r>
-              <w:rPr>
-                <w:rFonts w:ascii="Malgun Gothic" w:hAnsi="Malgun Gothic" w:eastAsia="Malgun Gothic"/>
-                <w:sz w:val="19"/>
-              </w:rPr>
-              <w:t>git --version과 Python 3.10+ 64-bit가 확인된다.</w:t>
+              <w:t>git --version과 py -3.12 --version이 확인된다.</w:t>
             </w:r>
           </w:p>
         </w:tc>
@@ -3184,14 +3140,7 @@
             <w:vAlign w:val="center"/>
           </w:tcPr>
           <w:p>
-            <w:pPr>
-              <w:spacing w:before="0" w:after="0"/>
-            </w:pPr>
             <w:r>
-              <w:rPr>
-                <w:rFonts w:ascii="Malgun Gothic" w:hAnsi="Malgun Gothic" w:eastAsia="Malgun Gothic"/>
-                <w:sz w:val="19"/>
-              </w:rPr>
               <w:t>setup 마지막에 [OK] 환경 검증 메시지가 나온다.</w:t>
             </w:r>
           </w:p>
@@ -3235,15 +3184,8 @@
             <w:vAlign w:val="center"/>
           </w:tcPr>
           <w:p>
-            <w:pPr>
-              <w:spacing w:before="0" w:after="0"/>
-            </w:pPr>
             <w:r>
-              <w:rPr>
-                <w:rFonts w:ascii="Malgun Gothic" w:hAnsi="Malgun Gothic" w:eastAsia="Malgun Gothic"/>
-                <w:sz w:val="19"/>
-              </w:rPr>
-              <w:t>git rev-parse HEAD로 전달받은 commit을 확인했다.</w:t>
+              <w:t>codex/v2와 전달받은 commit을 확인했다.</w:t>
             </w:r>
           </w:p>
         </w:tc>
@@ -3288,15 +3230,8 @@
             <w:vAlign w:val="center"/>
           </w:tcPr>
           <w:p>
-            <w:pPr>
-              <w:spacing w:before="0" w:after="0"/>
-            </w:pPr>
             <w:r>
-              <w:rPr>
-                <w:rFonts w:ascii="Malgun Gothic" w:hAnsi="Malgun Gothic" w:eastAsia="Malgun Gothic"/>
-                <w:sz w:val="19"/>
-              </w:rPr>
-              <w:t>dataset.json이 있는 데이터셋 루트를 선택했다.</w:t>
+              <w:t>원본 root 또는 dataset.json이 있는 configuration root를 선택했다.</w:t>
             </w:r>
           </w:p>
         </w:tc>
@@ -3339,15 +3274,8 @@
             <w:vAlign w:val="center"/>
           </w:tcPr>
           <w:p>
-            <w:pPr>
-              <w:spacing w:before="0" w:after="0"/>
-            </w:pPr>
             <w:r>
-              <w:rPr>
-                <w:rFonts w:ascii="Malgun Gothic" w:hAnsi="Malgun Gothic" w:eastAsia="Malgun Gothic"/>
-                <w:sz w:val="19"/>
-              </w:rPr>
-              <w:t>Preflight에서 frame 수와 MERGED, CAM_LEFT/CAM_RIGHT가 예상과 같다.</w:t>
+              <w:t>선택 profile의 활성 LiDAR가 정확히 하나이며 camera는 0~1개다.</w:t>
             </w:r>
           </w:p>
         </w:tc>
@@ -3392,14 +3320,7 @@
             <w:vAlign w:val="center"/>
           </w:tcPr>
           <w:p>
-            <w:pPr>
-              <w:spacing w:before="0" w:after="0"/>
-            </w:pPr>
             <w:r>
-              <w:rPr>
-                <w:rFonts w:ascii="Malgun Gothic" w:hAnsi="Malgun Gothic" w:eastAsia="Malgun Gothic"/>
-                <w:sz w:val="19"/>
-              </w:rPr>
               <w:t>Preflight error가 0이며 warning 원인을 확인했다.</w:t>
             </w:r>
           </w:p>
@@ -3443,15 +3364,8 @@
             <w:vAlign w:val="center"/>
           </w:tcPr>
           <w:p>
-            <w:pPr>
-              <w:spacing w:before="0" w:after="0"/>
-            </w:pPr>
             <w:r>
-              <w:rPr>
-                <w:rFonts w:ascii="Malgun Gothic" w:hAnsi="Malgun Gothic" w:eastAsia="Malgun Gothic"/>
-                <w:sz w:val="19"/>
-              </w:rPr>
-              <w:t>Calibration reference frame과 fingerprint를 확인했다.</w:t>
+              <w:t>BIN 전체 point columns, coordinate frame과 timestamp 설정을 확인했다.</w:t>
             </w:r>
           </w:p>
         </w:tc>
@@ -3496,15 +3410,8 @@
             <w:vAlign w:val="center"/>
           </w:tcPr>
           <w:p>
-            <w:pPr>
-              <w:spacing w:before="0" w:after="0"/>
-            </w:pPr>
             <w:r>
-              <w:rPr>
-                <w:rFonts w:ascii="Malgun Gothic" w:hAnsi="Malgun Gothic" w:eastAsia="Malgun Gothic"/>
-                <w:sz w:val="19"/>
-              </w:rPr>
-              <w:t>좌·우 카메라 projection이 정지 구조물에 맞는다.</w:t>
+              <w:t>camera/calibration이 없어도 LiDAR frame 이동·저장이 가능하다.</w:t>
             </w:r>
           </w:p>
         </w:tc>
@@ -3547,15 +3454,8 @@
             <w:vAlign w:val="center"/>
           </w:tcPr>
           <w:p>
-            <w:pPr>
-              <w:spacing w:before="0" w:after="0"/>
-            </w:pPr>
             <w:r>
-              <w:rPr>
-                <w:rFonts w:ascii="Malgun Gothic" w:hAnsi="Malgun Gothic" w:eastAsia="Malgun Gothic"/>
-                <w:sz w:val="19"/>
-              </w:rPr>
-              <w:t>sync QA에서 동일 이미지 반복과 큰 sample jump를 확인했다.</w:t>
+              <w:t>선택 camera가 있으면 projection을 정지 구조물에서 확인했다.</w:t>
             </w:r>
           </w:p>
         </w:tc>
@@ -3600,15 +3500,8 @@
             <w:vAlign w:val="center"/>
           </w:tcPr>
           <w:p>
-            <w:pPr>
-              <w:spacing w:before="0" w:after="0"/>
-            </w:pPr>
             <w:r>
-              <w:rPr>
-                <w:rFonts w:ascii="Malgun Gothic" w:hAnsi="Malgun Gothic" w:eastAsia="Malgun Gothic"/>
-                <w:sz w:val="19"/>
-              </w:rPr>
-              <w:t>테스트 박스를 저장하고 재실행해 ID, class, box 값이 유지된다.</w:t>
+              <w:t>테스트 박스를 저장·재실행해 profile/LiDAR/frame identity와 box 값이 유지된다.</w:t>
             </w:r>
           </w:p>
         </w:tc>
@@ -3651,15 +3544,8 @@
             <w:vAlign w:val="center"/>
           </w:tcPr>
           <w:p>
-            <w:pPr>
-              <w:spacing w:before="0" w:after="0"/>
-            </w:pPr>
             <w:r>
-              <w:rPr>
-                <w:rFonts w:ascii="Malgun Gothic" w:hAnsi="Malgun Gothic" w:eastAsia="Malgun Gothic"/>
-                <w:sz w:val="19"/>
-              </w:rPr>
-              <w:t>원본 source label 파일이 변경되지 않았다.</w:t>
+              <w:t>원본 point/image/timestamp/source label 파일이 변경되지 않았다.</w:t>
             </w:r>
           </w:p>
         </w:tc>
@@ -3704,15 +3590,8 @@
             <w:vAlign w:val="center"/>
           </w:tcPr>
           <w:p>
-            <w:pPr>
-              <w:spacing w:before="0" w:after="0"/>
-            </w:pPr>
             <w:r>
-              <w:rPr>
-                <w:rFonts w:ascii="Malgun Gothic" w:hAnsi="Malgun Gothic" w:eastAsia="Malgun Gothic"/>
-                <w:sz w:val="19"/>
-              </w:rPr>
-              <w:t>작업 라벨과 데이터셋을 정기 백업할 위치가 정해졌다.</w:t>
+              <w:t>작업 라벨과 configuration workspace를 백업할 위치가 정해졌다.</w:t>
             </w:r>
           </w:p>
         </w:tc>
@@ -3790,7 +3669,7 @@
         <w:rPr>
           <w:rFonts w:ascii="Malgun Gothic" w:hAnsi="Malgun Gothic" w:eastAsia="Malgun Gothic"/>
         </w:rPr>
-        <w:t>Python 64-bit를 다시 설치하며 PATH와 Python Launcher 옵션을 켭니다. Windows setup의 -PythonCommand 옵션으로 실행 파일을 직접 지정할 수도 있습니다.</w:t>
+        <w:t>python.org의 Python 3.12 Windows installer (64-bit)와 Python Launcher를 설치합니다. Microsoft Store alias나 Conda (base)만으로는 Windows setup의 공식 CPython 요구사항을 충족하지 않습니다.</w:t>
       </w:r>
     </w:p>
     <w:p>
@@ -3859,7 +3738,7 @@
         <w:rPr>
           <w:rFonts w:ascii="Malgun Gothic" w:hAnsi="Malgun Gothic" w:eastAsia="Malgun Gothic"/>
         </w:rPr>
-        <w:t>선택한 폴더 바로 아래에 dataset.json이 있는지 확인하고 먼저 Preflight를 실행합니다.</w:t>
+        <w:t>dataset.json이 없는 BIN/PCD 폴더는 오류가 아니라 범용 구성 대상입니다. 최신 codex/v2인지 확인하고 '데이터 폴더/데이터셋 열기'에서 원본 root를 선택합니다.</w:t>
       </w:r>
     </w:p>
     <w:p>
@@ -3882,7 +3761,7 @@
         <w:rPr>
           <w:rFonts w:ascii="Malgun Gothic" w:hAnsi="Malgun Gothic" w:eastAsia="Malgun Gothic"/>
         </w:rPr>
-        <w:t>이미지를 다시 추출하기 전에 sync/frames.jsonl의 camera sample 반복과 timestamp source를 확인하고 재동기화합니다.</w:t>
+        <w:t>범용 v2 재동기화에서 timestamp column/unit/clock domain, tolerance와 camera reuse를 확인합니다. one_chip legacy만 sync/frames.jsonl을 직접 사용합니다.</w:t>
       </w:r>
     </w:p>
     <w:p>
@@ -3943,7 +3822,7 @@
         <w:rPr>
           <w:rFonts w:ascii="Malgun Gothic" w:hAnsi="Malgun Gothic" w:eastAsia="Malgun Gothic"/>
         </w:rPr>
-        <w:t>저장소가 업데이트됐으면 git pull 후 setup을 다시 실행한다.</w:t>
+        <w:t>저장소가 업데이트됐으면 codex/v2를 pull한 뒤 OS별 setup을 다시 실행한다.</w:t>
       </w:r>
     </w:p>
     <w:p>
@@ -3973,7 +3852,7 @@
         <w:rPr>
           <w:rFonts w:ascii="Malgun Gothic" w:hAnsi="Malgun Gothic" w:eastAsia="Malgun Gothic"/>
         </w:rPr>
-        <w:t>run_windows.bat 또는 ./run_linux.sh를 실행한다.</w:t>
+        <w:t>launchers/windows/run_windows.bat 또는 ./launchers/linux/run_linux.sh를 실행한다.</w:t>
       </w:r>
     </w:p>
     <w:p>
@@ -3988,7 +3867,7 @@
         <w:rPr>
           <w:rFonts w:ascii="Malgun Gothic" w:hAnsi="Malgun Gothic" w:eastAsia="Malgun Gothic"/>
         </w:rPr>
-        <w:t>데이터셋 검사를 먼저 실행한다.</w:t>
+        <w:t>원본 폴더는 구성 분석, 기존 dataset은 데이터셋 검사를 먼저 실행한다.</w:t>
       </w:r>
     </w:p>
     <w:p>
@@ -4003,7 +3882,7 @@
         <w:rPr>
           <w:rFonts w:ascii="Malgun Gothic" w:hAnsi="Malgun Gothic" w:eastAsia="Malgun Gothic"/>
         </w:rPr>
-        <w:t>데이터셋 열기에서 dataset.json 폴더를 선택한다.</w:t>
+        <w:t>데이터 폴더/데이터셋 열기에서 원본 root 또는 configuration root를 선택한다.</w:t>
       </w:r>
     </w:p>
     <w:p>
@@ -4018,7 +3897,7 @@
         <w:rPr>
           <w:rFonts w:ascii="Malgun Gothic" w:hAnsi="Malgun Gothic" w:eastAsia="Malgun Gothic"/>
         </w:rPr>
-        <w:t>Calibration과 sync 상태를 확인한 뒤 라벨링한다.</w:t>
+        <w:t>활성 LiDAR profile, sync QA와 선택적 camera/calibration 상태를 확인한 뒤 라벨링한다.</w:t>
       </w:r>
     </w:p>
     <w:p>
@@ -4057,10 +3936,11 @@
       <w:r>
         <w:rPr>
           <w:rFonts w:ascii="Malgun Gothic" w:hAnsi="Malgun Gothic" w:eastAsia="Malgun Gothic"/>
+          <w:b w:val="0"/>
           <w:color w:val="243447"/>
           <w:sz w:val="21"/>
         </w:rPr>
-        <w:t>프로그램은 Git으로 업데이트하고, 실행 환경은 setup으로 맞추며, 데이터는 저장소 밖에서 Preflight 후 엽니다.</w:t>
+        <w:t>공식 Python을 설치하고 codex/v2를 setup한 뒤, 원본은 수정하지 않고 프로그램이 만든 profile/index로 라벨링합니다.</w:t>
       </w:r>
     </w:p>
     <w:p>

</xml_diff>